<commit_message>
court(mich-sc/petition-for-discretionary-review): latex and docx regenerated on the model of fb-595.54.82, cross-engine gated (fb-595.54.31)
Co-Authored-By: Claude Opus 5.5 <noreply@anthropic.com>

(fb-595.54.31)
</commit_message>
<xml_diff>
--- a/courts/sixth-circuit/michigan/state/supreme-court/petition-for-discretionary-review/usage/OUTPUT-petition-for-discretionary-review.docx
+++ b/courts/sixth-circuit/michigan/state/supreme-court/petition-for-discretionary-review/usage/OUTPUT-petition-for-discretionary-review.docx
@@ -6838,7 +6838,7 @@
         <w:t xml:space="preserve"> </w:t>
       </w:r>
       <w:r>
-        <w:t xml:space="preserve">https://www.michigan.gov/​mdhhs/​contact–mdhhs</w:t>
+        <w:t xml:space="preserve">https://​www.​michigan.​gov/​mdhhs/​contact–mdhhs</w:t>
       </w:r>
       <w:r>
         <w:t xml:space="preserve"> </w:t>
@@ -8972,7 +8972,7 @@
         <w:pStyle w:val="XdQuoteOnly"/>
       </w:pPr>
       <w:r>
-        <w:t xml:space="preserve">[The Attorney General venue statutes] exist in harmony with the [tort venue provisions], so that a party may properly establish venue under the AG venue statutes . . . or the tort venue statutes . . . . I would, therefore, remand to the Ingham County Circuit Court to determine whether it should transfer the case to the Oakland County Circuit Court in light of MCR 2.222(A).</w:t>
+        <w:t xml:space="preserve">[The Attorney General venue statutes] exist in harmony with the [tort venue provisions], so that a party may properly establish venue under the AG venue statutes . . . or the tort venue statutes . . . . I would, therefore, remand to the Ingham County Circuit Court to determine whether it should transfer the case to the Oakland County Circuit Court in light of MCR 2.222(A).</w:t>
       </w:r>
       <w:r>
         <w:t xml:space="preserve"> </w:t>
@@ -9471,7 +9471,7 @@
         <w:pStyle w:val="XdQuoteOnly"/>
       </w:pPr>
       <w:r>
-        <w:t xml:space="preserve">Any action at law brought by the attorney general in the name of the state or of the people of the state, for the use and benefit thereof, may be begun in the circuit court in and for the county of Ingham, and may be prosecuted to final judgment and satisfaction thereof, with like effect as though the cause of action arose in such county . . . .</w:t>
+        <w:t xml:space="preserve">Any action at law brought by the attorney general in the name of the state or of the people of the state, for the use and benefit thereof, may be begun in the circuit court in and for the county of Ingham, and may be prosecuted to final judgment and satisfaction thereof, with like effect as though the cause of action arose in such county . . . .</w:t>
       </w:r>
     </w:p>
     <w:p>
@@ -11493,7 +11493,7 @@
         <w:t xml:space="preserve">, 515 US 417, 434 n 9 (</w:t>
       </w:r>
       <w:r>
-        <w:t xml:space="preserve">“legal writers sometimes use . . .</w:t>
+        <w:t xml:space="preserve">“legal writers sometimes use . . .</w:t>
       </w:r>
       <w:r>
         <w:t xml:space="preserve"> </w:t>
@@ -16521,7 +16521,7 @@
         <w:t xml:space="preserve"> </w:t>
       </w:r>
       <w:r>
-        <w:t xml:space="preserve">https://www.michigan.gov/​mdhhs/​contact–mdhhs (accessed December 20, 2024).</w:t>
+        <w:t xml:space="preserve">https://​www.​michigan.​gov/​mdhhs/​contact–mdhhs (accessed December 20, 2024).</w:t>
       </w:r>
     </w:p>
   </w:footnote>
@@ -17310,6 +17310,7 @@
     <w:unhideWhenUsed/>
     <w:qFormat/>
     <w:pPr>
+      <w:keepLines/>
       <w:spacing w:before="0" w:after="110" w:line="276" w:lineRule="exact"/>
     </w:pPr>
     <w:rPr>
@@ -17560,6 +17561,33 @@
     <w:pPr>
       <w:spacing w:before="0" w:after="0" w:line="276" w:lineRule="exact"/>
       <w:ind w:left="2160" w:hanging="720"/>
+    </w:pPr>
+  </w:style>
+  <w:style w:type="paragraph" w:customStyle="1" w:styleId="XdQuoteList1">
+    <w:name w:val="Xd Quote List 1"/>
+    <w:basedOn w:val="Normal"/>
+    <w:qFormat/>
+    <w:pPr>
+      <w:spacing w:before="0" w:after="0" w:line="276" w:lineRule="exact"/>
+      <w:ind w:left="1440" w:right="720" w:hanging="720"/>
+    </w:pPr>
+  </w:style>
+  <w:style w:type="paragraph" w:customStyle="1" w:styleId="XdQuoteList2">
+    <w:name w:val="Xd Quote List 2"/>
+    <w:basedOn w:val="Normal"/>
+    <w:qFormat/>
+    <w:pPr>
+      <w:spacing w:before="0" w:after="0" w:line="276" w:lineRule="exact"/>
+      <w:ind w:left="2160" w:right="720" w:hanging="720"/>
+    </w:pPr>
+  </w:style>
+  <w:style w:type="paragraph" w:customStyle="1" w:styleId="XdQuoteList3">
+    <w:name w:val="Xd Quote List 3"/>
+    <w:basedOn w:val="Normal"/>
+    <w:qFormat/>
+    <w:pPr>
+      <w:spacing w:before="0" w:after="0" w:line="276" w:lineRule="exact"/>
+      <w:ind w:left="2880" w:right="720" w:hanging="720"/>
     </w:pPr>
   </w:style>
   <w:style w:type="paragraph" w:customStyle="1" w:styleId="XdQuote">

</xml_diff>

<commit_message>
chore(eval): re-render docx of the Michigan Supreme Court petition-for-discretionary-review on the fixed Word page lookup (fb-595.54.82)
Co-Authored-By: Claude Opus 5.5 <noreply@anthropic.com>
</commit_message>
<xml_diff>
--- a/courts/sixth-circuit/michigan/state/supreme-court/petition-for-discretionary-review/usage/OUTPUT-petition-for-discretionary-review.docx
+++ b/courts/sixth-circuit/michigan/state/supreme-court/petition-for-discretionary-review/usage/OUTPUT-petition-for-discretionary-review.docx
@@ -8972,7 +8972,7 @@
         <w:pStyle w:val="XdQuoteOnly"/>
       </w:pPr>
       <w:r>
-        <w:t xml:space="preserve">[The Attorney General venue statutes] exist in harmony with the [tort venue provisions], so that a party may properly establish venue under the AG venue statutes . . . or the tort venue statutes . . . . I would, therefore, remand to the Ingham County Circuit Court to determine whether it should transfer the case to the Oakland County Circuit Court in light of MCR 2.222(A).</w:t>
+        <w:t xml:space="preserve">[The Attorney General venue statutes] exist in harmony with the [tort venue provisions], so that a party may properly establish venue under the AG venue statutes ⁠. ⁠. ⁠. or the tort venue statutes ⁠. ⁠. ⁠. ⁠. I would, therefore, remand to the Ingham County Circuit Court to determine whether it should transfer the case to the Oakland County Circuit Court in light of MCR 2.222(A).</w:t>
       </w:r>
       <w:r>
         <w:t xml:space="preserve"> </w:t>
@@ -9471,7 +9471,7 @@
         <w:pStyle w:val="XdQuoteOnly"/>
       </w:pPr>
       <w:r>
-        <w:t xml:space="preserve">Any action at law brought by the attorney general in the name of the state or of the people of the state, for the use and benefit thereof, may be begun in the circuit court in and for the county of Ingham, and may be prosecuted to final judgment and satisfaction thereof, with like effect as though the cause of action arose in such county . . . .</w:t>
+        <w:t xml:space="preserve">Any action at law brought by the attorney general in the name of the state or of the people of the state, for the use and benefit thereof, may be begun in the circuit court in and for the county of Ingham, and may be prosecuted to final judgment and satisfaction thereof, with like effect as though the cause of action arose in such county ⁠. ⁠. ⁠. ⁠.</w:t>
       </w:r>
     </w:p>
     <w:p>
@@ -11493,7 +11493,7 @@
         <w:t xml:space="preserve">, 515 US 417, 434 n 9 (</w:t>
       </w:r>
       <w:r>
-        <w:t xml:space="preserve">“legal writers sometimes use . . .</w:t>
+        <w:t xml:space="preserve">“legal writers sometimes use ⁠. ⁠. ⁠.</w:t>
       </w:r>
       <w:r>
         <w:t xml:space="preserve"> </w:t>

</xml_diff>